<commit_message>
feat: worldwide remote framing and updated résumé
- Copy no longer reads as Brazil-only: availability, contact line,
  footer, meta description and OG image now say based in Brazil,
  working remotely with teams worldwide
- Résumé (DOCX + PDF exported from Word): AI-agent and LLM headline,
  new AI engineering skills line, Gemina ends Nov 2026 with the
  Claude-powered assistant chat bullet, worldwide availability
- OG image URL is now absolute (eduardo-greb.vercel.app)
- Type ErrorComponent with the router's ErrorComponentProps after the
  TanStack upgrade
- portfolio-facts skill records the worldwide framing and résumé flow

Co-Authored-By: Claude Opus 5.5 <noreply@anthropic.com>
</commit_message>
<xml_diff>
--- a/src/assets/Eduardo_Greb_Resume_2026.docx
+++ b/src/assets/Eduardo_Greb_Resume_2026.docx
@@ -19,7 +19,7 @@
         <w:jc w:val="center"/>
       </w:pPr>
       <w:r>
-        <w:t>Tech Lead &amp; Full-Stack Engineer</w:t>
+        <w:t>Tech Lead &amp; Full-Stack Engineer · AI-Agent Development &amp; LLM Integration</w:t>
       </w:r>
     </w:p>
     <w:p>
@@ -32,7 +32,7 @@
         <w:rPr>
           <w:sz w:val="18"/>
         </w:rPr>
-        <w:t xml:space="preserve">São Paulo, Brazil (UTC-3)  |  +55 11 96758-7869  |  </w:t>
+        <w:t xml:space="preserve">São Paulo, Brazil (UTC-3), remote worldwide  |  +55 11 96758-7869  |  </w:t>
       </w:r>
       <w:hyperlink r:id="rId9">
         <w:r>
@@ -90,7 +90,7 @@
           <w:b/>
           <w:color w:val="385466"/>
         </w:rPr>
-        <w:t>Available for remote international contractor / B2B roles</w:t>
+        <w:t>Available now for remote contractor / B2B roles with teams worldwide</w:t>
       </w:r>
     </w:p>
     <w:p>
@@ -113,7 +113,7 @@
         <w:spacing w:after="40"/>
       </w:pPr>
       <w:r>
-        <w:t>Hands-on Tech Lead and Full-Stack Engineer with 8+ years of professional software experience across web, backend, cloud, mobile, game, and real-time systems. Strong production experience in both C#/.NET and TypeScript/Node.js, with React, SQL/PostgreSQL, Docker, AWS/Azure, and CI/CD. At Gemina, built the technical foundation of a cybersecurity monitoring platform from zero, selecting the stack and architecture while continuing to code and lead technical delivery. Experienced working remotely with teams and clients in Brazil, the United States, and Canada.</w:t>
+        <w:t>Hands-on Tech Lead and Full-Stack Engineer with 8+ years of professional software experience across web, backend, cloud, mobile, game, and real-time systems. I design the architecture, direct AI coding agents (Claude Code, Cursor, GitHub Copilot) to write the code, and own code review, testing, and what reaches production. Strong production experience in both C#/.NET and TypeScript/Node.js, with React, SQL/PostgreSQL, Docker, AWS/Azure, and CI/CD. At Gemina, built a cybersecurity monitoring platform from zero, selecting the stack and architecture, leading technical delivery, and integrating a Claude-powered AI assistant chat into the product. Experienced working remotely with teams and clients in Brazil, the United States, and Canada.</w:t>
       </w:r>
     </w:p>
     <w:p>
@@ -128,6 +128,21 @@
       </w:pPr>
       <w:r>
         <w:t>CORE SKILLS</w:t>
+      </w:r>
+    </w:p>
+    <w:p>
+      <w:pPr>
+        <w:keepLines/>
+        <w:spacing w:after="20"/>
+      </w:pPr>
+      <w:r>
+        <w:rPr>
+          <w:b/>
+        </w:rPr>
+        <w:t xml:space="preserve">AI engineering: </w:t>
+      </w:r>
+      <w:r>
+        <w:t>AI coding agents (Claude Code, Cursor, GitHub Copilot, Lovable), LLM API integration (Claude, OpenAI, Gemini, DeepSeek), spec- and context-driven development</w:t>
       </w:r>
     </w:p>
     <w:p>
@@ -259,7 +274,7 @@
         <w:t>Gemina</w:t>
       </w:r>
       <w:r>
-        <w:t xml:space="preserve">  |  Brazil - Remote  |  Jul 2025 - Present</w:t>
+        <w:t xml:space="preserve">  |  Brazil - Remote  |  Jul 2025 - Nov 2026</w:t>
       </w:r>
     </w:p>
     <w:p>
@@ -289,7 +304,17 @@
         <w:ind w:left="259" w:hanging="173"/>
       </w:pPr>
       <w:r>
-        <w:t>• Remain hands-on across backend and frontend development while owning technical decisions, code review, testing expectations, and architecture evolution.</w:t>
+        <w:t>• Integrated a Claude-powered AI assistant chat into the monitoring dashboard, from the LLM API to the in-product UI.</w:t>
+      </w:r>
+    </w:p>
+    <w:p>
+      <w:pPr>
+        <w:keepLines/>
+        <w:spacing w:after="24"/>
+        <w:ind w:left="259" w:hanging="173"/>
+      </w:pPr>
+      <w:r>
+        <w:t>• Remained hands-on across backend and frontend development while owning technical decisions, code review, testing expectations, and architecture evolution.</w:t>
       </w:r>
     </w:p>
     <w:p>
@@ -309,7 +334,7 @@
         <w:ind w:left="259" w:hanging="173"/>
       </w:pPr>
       <w:r>
-        <w:t>• Work with security-sensitive client environments; product, client, and private architecture details are intentionally confidential.</w:t>
+        <w:t>• Worked with security-sensitive client environments; product, client, and private architecture details are intentionally confidential.</w:t>
       </w:r>
     </w:p>
     <w:p>
@@ -325,7 +350,7 @@
         <w:t xml:space="preserve">Core stack: </w:t>
       </w:r>
       <w:r>
-        <w:t>Node.js, TypeScript, React</w:t>
+        <w:t>Node.js, TypeScript, React, Claude (LLM API)</w:t>
       </w:r>
     </w:p>
     <w:p>

</xml_diff>

<commit_message>
feat: mobile and AI-agent setup emphasis on site and résumé
Adds confirmed mobile experience (React Native, Flutter, native Swift/Kotlin,
store releases, deep links, offline-first, OAuth/OIDC, push SDKs, WCAG) and the
agent setup used day to day (skills, subagents, MCP, CLAUDE.md/hooks).

Co-Authored-By: Claude Opus 5.5 <noreply@anthropic.com>
</commit_message>
<xml_diff>
--- a/src/assets/Eduardo_Greb_Resume_2026.docx
+++ b/src/assets/Eduardo_Greb_Resume_2026.docx
@@ -19,7 +19,7 @@
         <w:jc w:val="center"/>
       </w:pPr>
       <w:r>
-        <w:t>Tech Lead &amp; Full-Stack Engineer · AI-Agent Development &amp; LLM Integration</w:t>
+        <w:t>Tech Lead &amp; Full-Stack / Mobile Engineer · AI-Agent Development &amp; LLM Integration</w:t>
       </w:r>
     </w:p>
     <w:p>
@@ -113,7 +113,7 @@
         <w:spacing w:after="40"/>
       </w:pPr>
       <w:r>
-        <w:t>Hands-on Tech Lead and Full-Stack Engineer with 8+ years of professional software experience across web, backend, cloud, mobile, game, and real-time systems. I design the architecture, direct AI coding agents (Claude Code, Cursor, GitHub Copilot) to write the code, and own code review, testing, and what reaches production. Strong production experience in both C#/.NET and TypeScript/Node.js, with React, SQL/PostgreSQL, Docker, AWS/Azure, and CI/CD. At Gemina, built a cybersecurity monitoring platform from zero, selecting the stack and architecture, leading technical delivery, and integrating a Claude-powered AI assistant chat into the product. Experienced working remotely with teams and clients in Brazil, the United States, and Canada.</w:t>
+        <w:t>Hands-on Tech Lead and Full-Stack Engineer with 8+ years of professional software experience across web, mobile (React Native, Flutter, native iOS/Android), backend, cloud, game, and real-time systems. I design the architecture and direct AI coding agents (Claude Code, Cursor, GitHub Copilot) set up with project skills, parallel subagents, MCP servers, and CLAUDE.md rules and hooks, while owning code review, testing, and what reaches production. Strong production experience in both C#/.NET and TypeScript/Node.js, with React, SQL/PostgreSQL, Docker, AWS/Azure, and CI/CD. At Gemina, built a cybersecurity monitoring platform from zero, selecting the stack and architecture, leading technical delivery, and integrating a Claude-powered AI assistant chat into the product. Experienced working remotely with teams and clients in Brazil, the United States, and Canada.</w:t>
       </w:r>
     </w:p>
     <w:p>
@@ -142,7 +142,7 @@
         <w:t xml:space="preserve">AI engineering: </w:t>
       </w:r>
       <w:r>
-        <w:t>AI coding agents (Claude Code, Cursor, GitHub Copilot, Lovable), LLM API integration (Claude, OpenAI, Gemini, DeepSeek), spec- and context-driven development</w:t>
+        <w:t>AI coding agents (Claude Code, Cursor, GitHub Copilot, Lovable), agent setup (skills, subagents, MCP servers, CLAUDE.md/rules, hooks), LLM API integration (Claude, OpenAI, Gemini, DeepSeek), spec- and context-driven development</w:t>
       </w:r>
     </w:p>
     <w:p>
@@ -157,7 +157,7 @@
         <w:t xml:space="preserve">Backend &amp; systems: </w:t>
       </w:r>
       <w:r>
-        <w:t>C#, .NET, TypeScript, Node.js, REST APIs, GraphQL, RabbitMQ, Kafka</w:t>
+        <w:t>C#, .NET, TypeScript, Node.js, REST APIs, GraphQL, OAuth 2.0/OIDC, RabbitMQ, Kafka</w:t>
       </w:r>
     </w:p>
     <w:p>
@@ -172,7 +172,22 @@
         <w:t xml:space="preserve">Frontend: </w:t>
       </w:r>
       <w:r>
-        <w:t>React, TypeScript, JavaScript, React Native</w:t>
+        <w:t>React, TypeScript, JavaScript, WCAG accessibility</w:t>
+      </w:r>
+    </w:p>
+    <w:p>
+      <w:pPr>
+        <w:keepLines/>
+        <w:spacing w:after="20"/>
+      </w:pPr>
+      <w:r>
+        <w:rPr>
+          <w:b/>
+        </w:rPr>
+        <w:t xml:space="preserve">Mobile: </w:t>
+      </w:r>
+      <w:r>
+        <w:t>React Native, Flutter/Dart, Swift (iOS), Kotlin/Java (Android), native modules, App Store and Google Play releases (signing, CI/CD), Universal Links/App Links, offline-first, push SDKs</w:t>
       </w:r>
     </w:p>
     <w:p>
@@ -232,7 +247,7 @@
         <w:t xml:space="preserve">Additional experience: </w:t>
       </w:r>
       <w:r>
-        <w:t>Unity, Unreal Engine, C++, Flutter/Dart, Java/Spring, PHP/Laravel, Go, Python</w:t>
+        <w:t>Unity, Unreal Engine, C++, Java/Spring, PHP/Laravel, Go, Python</w:t>
       </w:r>
     </w:p>
     <w:p>
@@ -634,7 +649,7 @@
         <w:ind w:left="259" w:hanging="173"/>
       </w:pPr>
       <w:r>
-        <w:t>• Built mobile applications with Flutter/Dart and maintained customer web and server environments.</w:t>
+        <w:t>• Built mobile applications with Flutter/Dart, plus native iOS (Swift) and Android (Kotlin, Java) development, and maintained customer web and server environments.</w:t>
       </w:r>
     </w:p>
     <w:p>
@@ -660,7 +675,7 @@
         <w:t xml:space="preserve">Core stack: </w:t>
       </w:r>
       <w:r>
-        <w:t>C#, .NET, TypeScript, Node.js, React, Flutter, Java/Spring, PHP/Laravel, SQL</w:t>
+        <w:t>C#, .NET, TypeScript, Node.js, React, Flutter, Swift, Kotlin, Java/Spring, PHP/Laravel, SQL</w:t>
       </w:r>
     </w:p>
     <w:p>

</xml_diff>